<commit_message>
Update README.md with additional notes and corrections; modify header in landscape.docx for clarity.
</commit_message>
<xml_diff>
--- a/header, landscape.docx
+++ b/header, landscape.docx
@@ -212,7 +212,27 @@
           <w:bCs/>
           <w:sz w:val="20"/>
         </w:rPr>
-        <w:t>Ratnanagar-7, Sauraha, Chitwan</w:t>
+        <w:t xml:space="preserve">Ratnanagar-7, </w:t>
+      </w:r>
+      <w:proofErr w:type="spellStart"/>
+      <w:r>
+        <w:rPr>
+          <w:rFonts w:ascii="Times New Roman" w:hAnsi="Times New Roman"/>
+          <w:b/>
+          <w:bCs/>
+          <w:sz w:val="20"/>
+        </w:rPr>
+        <w:t>Sauraha</w:t>
+      </w:r>
+      <w:proofErr w:type="spellEnd"/>
+      <w:r>
+        <w:rPr>
+          <w:rFonts w:ascii="Times New Roman" w:hAnsi="Times New Roman"/>
+          <w:b/>
+          <w:bCs/>
+          <w:sz w:val="20"/>
+        </w:rPr>
+        <w:t>, Chitwan</w:t>
       </w:r>
     </w:p>
     <w:p>
@@ -645,6 +665,7 @@
           </mc:Fallback>
         </mc:AlternateContent>
       </w:r>
+      <w:proofErr w:type="spellStart"/>
       <w:r>
         <w:rPr>
           <w:rFonts w:ascii="Preeti" w:hAnsi="Preeti"/>
@@ -664,9 +685,9 @@
           <w:sz w:val="40"/>
           <w:szCs w:val="40"/>
         </w:rPr>
-        <w:t>Lg ;f];fO</w:t>
-      </w:r>
-      <w:proofErr w:type="gramEnd"/>
+        <w:t>Lg</w:t>
+      </w:r>
+      <w:proofErr w:type="spellEnd"/>
       <w:r>
         <w:rPr>
           <w:rFonts w:ascii="Preeti" w:hAnsi="Preeti"/>
@@ -675,9 +696,9 @@
           <w:sz w:val="40"/>
           <w:szCs w:val="40"/>
         </w:rPr>
-        <w:t xml:space="preserve">6L </w:t>
-      </w:r>
-      <w:proofErr w:type="gramStart"/>
+        <w:t xml:space="preserve"> ;f];fO</w:t>
+      </w:r>
+      <w:proofErr w:type="gramEnd"/>
       <w:r>
         <w:rPr>
           <w:rFonts w:ascii="Preeti" w:hAnsi="Preeti"/>
@@ -686,8 +707,43 @@
           <w:sz w:val="40"/>
           <w:szCs w:val="40"/>
         </w:rPr>
-        <w:t>klAns :s'n</w:t>
-      </w:r>
+        <w:t xml:space="preserve">6L </w:t>
+      </w:r>
+      <w:proofErr w:type="spellStart"/>
+      <w:proofErr w:type="gramStart"/>
+      <w:r>
+        <w:rPr>
+          <w:rFonts w:ascii="Preeti" w:hAnsi="Preeti"/>
+          <w:b/>
+          <w:bCs/>
+          <w:sz w:val="40"/>
+          <w:szCs w:val="40"/>
+        </w:rPr>
+        <w:t>klAns</w:t>
+      </w:r>
+      <w:proofErr w:type="spellEnd"/>
+      <w:r>
+        <w:rPr>
+          <w:rFonts w:ascii="Preeti" w:hAnsi="Preeti"/>
+          <w:b/>
+          <w:bCs/>
+          <w:sz w:val="40"/>
+          <w:szCs w:val="40"/>
+        </w:rPr>
+        <w:t xml:space="preserve"> :</w:t>
+      </w:r>
+      <w:proofErr w:type="spellStart"/>
+      <w:r>
+        <w:rPr>
+          <w:rFonts w:ascii="Preeti" w:hAnsi="Preeti"/>
+          <w:b/>
+          <w:bCs/>
+          <w:sz w:val="40"/>
+          <w:szCs w:val="40"/>
+        </w:rPr>
+        <w:t>s'n</w:t>
+      </w:r>
+      <w:proofErr w:type="spellEnd"/>
       <w:proofErr w:type="gramEnd"/>
     </w:p>
     <w:p>
@@ -709,8 +765,29 @@
           <w:sz w:val="28"/>
           <w:szCs w:val="28"/>
         </w:rPr>
-        <w:t xml:space="preserve">/Tggu/–&amp;, </w:t>
-      </w:r>
+        <w:t>/</w:t>
+      </w:r>
+      <w:proofErr w:type="spellStart"/>
+      <w:r>
+        <w:rPr>
+          <w:rFonts w:ascii="Preeti" w:hAnsi="Preeti"/>
+          <w:b/>
+          <w:sz w:val="28"/>
+          <w:szCs w:val="28"/>
+        </w:rPr>
+        <w:t>Tggu</w:t>
+      </w:r>
+      <w:proofErr w:type="spellEnd"/>
+      <w:r>
+        <w:rPr>
+          <w:rFonts w:ascii="Preeti" w:hAnsi="Preeti"/>
+          <w:b/>
+          <w:sz w:val="28"/>
+          <w:szCs w:val="28"/>
+        </w:rPr>
+        <w:t xml:space="preserve">/–&amp;, </w:t>
+      </w:r>
+      <w:proofErr w:type="spellStart"/>
       <w:r>
         <w:rPr>
           <w:rFonts w:ascii="Preeti" w:hAnsi="Preeti"/>
@@ -720,6 +797,7 @@
         </w:rPr>
         <w:t>lrtjg</w:t>
       </w:r>
+      <w:proofErr w:type="spellEnd"/>
     </w:p>
     <w:p>
       <w:pPr>
@@ -784,8 +862,9 @@
           <w:szCs w:val="28"/>
           <w:u w:val="single"/>
         </w:rPr>
-        <w:t>q}d</w:t>
-      </w:r>
+        <w:t>q}</w:t>
+      </w:r>
+      <w:proofErr w:type="spellStart"/>
       <w:r>
         <w:rPr>
           <w:rFonts w:ascii="Preeti" w:hAnsi="Preeti"/>
@@ -794,6 +873,16 @@
           <w:szCs w:val="28"/>
           <w:u w:val="single"/>
         </w:rPr>
+        <w:t>d</w:t>
+      </w:r>
+      <w:r>
+        <w:rPr>
+          <w:rFonts w:ascii="Preeti" w:hAnsi="Preeti"/>
+          <w:b/>
+          <w:sz w:val="28"/>
+          <w:szCs w:val="28"/>
+          <w:u w:val="single"/>
+        </w:rPr>
         <w:t>fl</w:t>
       </w:r>
       <w:proofErr w:type="gramEnd"/>
@@ -805,7 +894,40 @@
           <w:szCs w:val="28"/>
           <w:u w:val="single"/>
         </w:rPr>
-        <w:t>;s k/LIff–</w:t>
+        <w:t>;s</w:t>
+      </w:r>
+      <w:proofErr w:type="spellEnd"/>
+      <w:r>
+        <w:rPr>
+          <w:rFonts w:ascii="Preeti" w:hAnsi="Preeti"/>
+          <w:b/>
+          <w:sz w:val="28"/>
+          <w:szCs w:val="28"/>
+          <w:u w:val="single"/>
+        </w:rPr>
+        <w:t xml:space="preserve"> k/</w:t>
+      </w:r>
+      <w:proofErr w:type="spellStart"/>
+      <w:r>
+        <w:rPr>
+          <w:rFonts w:ascii="Preeti" w:hAnsi="Preeti"/>
+          <w:b/>
+          <w:sz w:val="28"/>
+          <w:szCs w:val="28"/>
+          <w:u w:val="single"/>
+        </w:rPr>
+        <w:t>LIff</w:t>
+      </w:r>
+      <w:proofErr w:type="spellEnd"/>
+      <w:r>
+        <w:rPr>
+          <w:rFonts w:ascii="Preeti" w:hAnsi="Preeti"/>
+          <w:b/>
+          <w:sz w:val="28"/>
+          <w:szCs w:val="28"/>
+          <w:u w:val="single"/>
+        </w:rPr>
+        <w:t>–</w:t>
       </w:r>
       <w:proofErr w:type="gramStart"/>
       <w:r>
@@ -839,6 +961,7 @@
           <w:lang w:eastAsia="zh-CN"/>
         </w:rPr>
       </w:pPr>
+      <w:proofErr w:type="spellStart"/>
       <w:r>
         <w:rPr>
           <w:rFonts w:ascii="Preeti" w:hAnsi="Preeti"/>
@@ -848,6 +971,7 @@
         </w:rPr>
         <w:t>sIff</w:t>
       </w:r>
+      <w:proofErr w:type="spellEnd"/>
       <w:r>
         <w:rPr>
           <w:rFonts w:ascii="Preeti" w:hAnsi="Preeti" w:cs="Times New Roman"/>
@@ -977,7 +1101,7 @@
           <w:sz w:val="28"/>
           <w:szCs w:val="28"/>
         </w:rPr>
-        <w:t>f{f</w:t>
+        <w:t>ff{</w:t>
       </w:r>
       <w:r>
         <w:rPr>
@@ -990,6 +1114,16 @@
         <w:t>Í  –</w:t>
       </w:r>
       <w:proofErr w:type="gramEnd"/>
+      <w:r>
+        <w:rPr>
+          <w:rFonts w:ascii="Preeti" w:hAnsi="Preeti" w:cs="Times New Roman"/>
+          <w:b/>
+          <w:sz w:val="28"/>
+          <w:szCs w:val="28"/>
+          <w:lang w:eastAsia="zh-CN"/>
+        </w:rPr>
+        <w:t xml:space="preserve"> </w:t>
+      </w:r>
       <w:r>
         <w:rPr>
           <w:rFonts w:ascii="Preeti" w:hAnsi="Preeti" w:cs="Times New Roman"/>
@@ -1013,6 +1147,7 @@
           <w:lang w:eastAsia="zh-CN"/>
         </w:rPr>
       </w:pPr>
+      <w:proofErr w:type="spellStart"/>
       <w:r>
         <w:rPr>
           <w:rFonts w:ascii="Preeti" w:hAnsi="Preeti" w:cs="Arial"/>
@@ -1024,6 +1159,7 @@
         </w:rPr>
         <w:t>ljifo</w:t>
       </w:r>
+      <w:proofErr w:type="spellEnd"/>
       <w:r>
         <w:rPr>
           <w:rFonts w:ascii="Preeti" w:hAnsi="Preeti"/>
@@ -1042,18 +1178,59 @@
           <w:szCs w:val="32"/>
           <w:lang w:eastAsia="zh-CN"/>
         </w:rPr>
-        <w:t>g]kfnL</w:t>
-      </w:r>
-      <w:r>
-        <w:rPr>
-          <w:rFonts w:ascii="Preeti" w:hAnsi="Preeti"/>
+        <w:t>g]</w:t>
+      </w:r>
+      <w:proofErr w:type="spellStart"/>
+      <w:r>
+        <w:rPr>
+          <w:rFonts w:ascii="Preeti" w:hAnsi="Preeti" w:cs="Times New Roman"/>
           <w:b/>
           <w:sz w:val="32"/>
           <w:szCs w:val="32"/>
+          <w:lang w:eastAsia="zh-CN"/>
+        </w:rPr>
+        <w:t>kfnL</w:t>
+      </w:r>
+      <w:proofErr w:type="spellEnd"/>
+      <w:r>
+        <w:rPr>
+          <w:rFonts w:ascii="Preeti" w:hAnsi="Preeti"/>
+          <w:b/>
+          <w:sz w:val="32"/>
+          <w:szCs w:val="32"/>
         </w:rPr>
         <w:tab/>
-        <w:t>;fdfhLs</w:t>
-      </w:r>
+        <w:t>;</w:t>
+      </w:r>
+      <w:proofErr w:type="spellStart"/>
+      <w:r>
+        <w:rPr>
+          <w:rFonts w:ascii="Preeti" w:hAnsi="Preeti"/>
+          <w:b/>
+          <w:sz w:val="32"/>
+          <w:szCs w:val="32"/>
+        </w:rPr>
+        <w:t>fdf</w:t>
+      </w:r>
+      <w:r>
+        <w:rPr>
+          <w:rFonts w:ascii="Preeti" w:hAnsi="Preeti"/>
+          <w:b/>
+          <w:sz w:val="32"/>
+          <w:szCs w:val="32"/>
+        </w:rPr>
+        <w:t>l</w:t>
+      </w:r>
+      <w:r>
+        <w:rPr>
+          <w:rFonts w:ascii="Preeti" w:hAnsi="Preeti"/>
+          <w:b/>
+          <w:sz w:val="32"/>
+          <w:szCs w:val="32"/>
+        </w:rPr>
+        <w:t>hs</w:t>
+      </w:r>
+      <w:proofErr w:type="spellEnd"/>
       <w:proofErr w:type="gramEnd"/>
       <w:r>
         <w:rPr>

</xml_diff>